<commit_message>
Correcion de anexo tecnico defazado
</commit_message>
<xml_diff>
--- a/back/src/static/todoSilver/Anexo Técnico.docx
+++ b/back/src/static/todoSilver/Anexo Técnico.docx
@@ -1,6 +1,6 @@
 
 <file path=word/document.xml><?xml version="1.0" encoding="utf-8"?>
-<w:document xmlns:wpc="http://schemas.microsoft.com/office/word/2010/wordprocessingCanvas" xmlns:cx="http://schemas.microsoft.com/office/drawing/2014/chartex" xmlns:cx1="http://schemas.microsoft.com/office/drawing/2015/9/8/chartex" xmlns:cx2="http://schemas.microsoft.com/office/drawing/2015/10/21/chartex" xmlns:cx3="http://schemas.microsoft.com/office/drawing/2016/5/9/chartex" xmlns:cx4="http://schemas.microsoft.com/office/drawing/2016/5/10/chartex" xmlns:cx5="http://schemas.microsoft.com/office/drawing/2016/5/11/chartex" xmlns:cx6="http://schemas.microsoft.com/office/drawing/2016/5/12/chartex" xmlns:cx7="http://schemas.microsoft.com/office/drawing/2016/5/13/chartex" xmlns:cx8="http://schemas.microsoft.com/office/drawing/2016/5/14/chartex" xmlns:mc="http://schemas.openxmlformats.org/markup-compatibility/2006" xmlns:aink="http://schemas.microsoft.com/office/drawing/2016/ink" xmlns:am3d="http://schemas.microsoft.com/office/drawing/2017/model3d" xmlns:o="urn:schemas-microsoft-com:office:office" xmlns:oel="http://schemas.microsoft.com/office/2019/extlst" xmlns:r="http://schemas.openxmlformats.org/officeDocument/2006/relationships" xmlns:m="http://schemas.openxmlformats.org/officeDocument/2006/math" xmlns:v="urn:schemas-microsoft-com:vml" xmlns:wp14="http://schemas.microsoft.com/office/word/2010/wordprocessingDrawing" xmlns:wp="http://schemas.openxmlformats.org/drawingml/2006/wordprocessingDrawing" xmlns:w10="urn:schemas-microsoft-com:office:word" xmlns:w="http://schemas.openxmlformats.org/wordprocessingml/2006/main" xmlns:w14="http://schemas.microsoft.com/office/word/2010/wordml" xmlns:w15="http://schemas.microsoft.com/office/word/2012/wordml" xmlns:w16cex="http://schemas.microsoft.com/office/word/2018/wordml/cex" xmlns:w16cid="http://schemas.microsoft.com/office/word/2016/wordml/cid" xmlns:w16="http://schemas.microsoft.com/office/word/2018/wordml" xmlns:w16du="http://schemas.microsoft.com/office/word/2023/wordml/word16du" xmlns:w16sdtdh="http://schemas.microsoft.com/office/word/2020/wordml/sdtdatahash" xmlns:w16sdtfl="http://schemas.microsoft.com/office/word/2024/wordml/sdtformatlock" xmlns:w16se="http://schemas.microsoft.com/office/word/2015/wordml/symex" xmlns:wpg="http://schemas.microsoft.com/office/word/2010/wordprocessingGroup" xmlns:wpi="http://schemas.microsoft.com/office/word/2010/wordprocessingInk" xmlns:wne="http://schemas.microsoft.com/office/word/2006/wordml" xmlns:wps="http://schemas.microsoft.com/office/word/2010/wordprocessingShape" mc:Ignorable="w14 w15 w16se w16cid w16 w16cex w16sdtdh w16sdtfl w16du wp14">
+<w:document xmlns:wpc="http://schemas.microsoft.com/office/word/2010/wordprocessingCanvas" xmlns:cx="http://schemas.microsoft.com/office/drawing/2014/chartex" xmlns:cx1="http://schemas.microsoft.com/office/drawing/2015/9/8/chartex" xmlns:cx2="http://schemas.microsoft.com/office/drawing/2015/10/21/chartex" xmlns:cx3="http://schemas.microsoft.com/office/drawing/2016/5/9/chartex" xmlns:cx4="http://schemas.microsoft.com/office/drawing/2016/5/10/chartex" xmlns:cx5="http://schemas.microsoft.com/office/drawing/2016/5/11/chartex" xmlns:cx6="http://schemas.microsoft.com/office/drawing/2016/5/12/chartex" xmlns:cx7="http://schemas.microsoft.com/office/drawing/2016/5/13/chartex" xmlns:cx8="http://schemas.microsoft.com/office/drawing/2016/5/14/chartex" xmlns:mc="http://schemas.openxmlformats.org/markup-compatibility/2006" xmlns:aink="http://schemas.microsoft.com/office/drawing/2016/ink" xmlns:am3d="http://schemas.microsoft.com/office/drawing/2017/model3d" xmlns:o="urn:schemas-microsoft-com:office:office" xmlns:oel="http://schemas.microsoft.com/office/2019/extlst" xmlns:r="http://schemas.openxmlformats.org/officeDocument/2006/relationships" xmlns:m="http://schemas.openxmlformats.org/officeDocument/2006/math" xmlns:v="urn:schemas-microsoft-com:vml" xmlns:wp14="http://schemas.microsoft.com/office/word/2010/wordprocessingDrawing" xmlns:wp="http://schemas.openxmlformats.org/drawingml/2006/wordprocessingDrawing" xmlns:w10="urn:schemas-microsoft-com:office:word" xmlns:w="http://schemas.openxmlformats.org/wordprocessingml/2006/main" xmlns:w14="http://schemas.microsoft.com/office/word/2010/wordml" xmlns:w15="http://schemas.microsoft.com/office/word/2012/wordml" xmlns:w16cei="http://schemas.microsoft.com/office/word/2026/wordml/cei" xmlns:w16cex="http://schemas.microsoft.com/office/word/2018/wordml/cex" xmlns:w16cid="http://schemas.microsoft.com/office/word/2016/wordml/cid" xmlns:w16="http://schemas.microsoft.com/office/word/2018/wordml" xmlns:w16du="http://schemas.microsoft.com/office/word/2023/wordml/word16du" xmlns:w16sdtdh="http://schemas.microsoft.com/office/word/2020/wordml/sdtdatahash" xmlns:w16sdtfl="http://schemas.microsoft.com/office/word/2024/wordml/sdtformatlock" xmlns:w16se="http://schemas.microsoft.com/office/word/2015/wordml/symex" xmlns:wpg="http://schemas.microsoft.com/office/word/2010/wordprocessingGroup" xmlns:wpi="http://schemas.microsoft.com/office/word/2010/wordprocessingInk" xmlns:wne="http://schemas.microsoft.com/office/word/2006/wordml" xmlns:wps="http://schemas.microsoft.com/office/word/2010/wordprocessingShape" mc:Ignorable="w14 w15 w16se w16cid w16 w16cex w16sdtdh w16sdtfl w16du wp14">
   <w:body>
     <w:p>
       <w:pPr>
@@ -1017,7 +1017,7 @@
                 </mc:Choice>
                 <mc:Fallback>
                   <w:pict>
-                    <v:group w14:anchorId="207BD2D8" id="Group 3" o:spid="_x0000_s1026" style="position:absolute;margin-left:26.8pt;margin-top:-26.25pt;width:18.7pt;height:19.85pt;z-index:15729152;mso-wrap-distance-left:0;mso-wrap-distance-right:0" coordsize="237490,252095" o:gfxdata="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">
+                    <v:group w14:anchorId="5BA8535A" id="Group 3" o:spid="_x0000_s1026" style="position:absolute;margin-left:26.8pt;margin-top:-26.25pt;width:18.7pt;height:19.85pt;z-index:15729152;mso-wrap-distance-left:0;mso-wrap-distance-right:0" coordsize="237490,252095" o:gfxdata="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">
                       <v:shapetype id="_x0000_t75" coordsize="21600,21600" o:spt="75" o:preferrelative="t" path="m@4@5l@4@11@9@11@9@5xe" filled="f" stroked="f">
                         <v:stroke joinstyle="miter"/>
                         <v:formulas>
@@ -1371,7 +1371,7 @@
           </mc:Choice>
           <mc:Fallback>
             <w:pict>
-              <v:shape w14:anchorId="544B0BA5" id="Graphic 5" o:spid="_x0000_s1026" style="position:absolute;margin-left:85.1pt;margin-top:-176.85pt;width:441.45pt;height:164.55pt;z-index:-15995392;visibility:visible;mso-wrap-style:square;mso-wrap-distance-left:0;mso-wrap-distance-top:0;mso-wrap-distance-right:0;mso-wrap-distance-bottom:0;mso-position-horizontal:absolute;mso-position-horizontal-relative:page;mso-position-vertical:absolute;mso-position-vertical-relative:text;v-text-anchor:top" coordsize="5606415,2089785" o:gfxdata="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" path="m2802890,l,,,1475486r,614172l2802890,2089658r,-614172l2802890,xem5606237,l2802966,r,1475486l2802966,2089658r2803271,l5606237,1475486,5606237,xe" fillcolor="#d1d1d1" stroked="f">
+              <v:shape w14:anchorId="0BAD8656" id="Graphic 5" o:spid="_x0000_s1026" style="position:absolute;margin-left:85.1pt;margin-top:-176.85pt;width:441.45pt;height:164.55pt;z-index:-15995392;visibility:visible;mso-wrap-style:square;mso-wrap-distance-left:0;mso-wrap-distance-top:0;mso-wrap-distance-right:0;mso-wrap-distance-bottom:0;mso-position-horizontal:absolute;mso-position-horizontal-relative:page;mso-position-vertical:absolute;mso-position-vertical-relative:text;v-text-anchor:top" coordsize="5606415,2089785" o:gfxdata="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" path="m2802890,l,,,1475486r,614172l2802890,2089658r,-614172l2802890,xem5606237,l2802966,r,1475486l2802966,2089658r2803271,l5606237,1475486,5606237,xe" fillcolor="#d1d1d1" stroked="f">
                 <v:path arrowok="t"/>
                 <w10:wrap anchorx="page"/>
               </v:shape>
@@ -3372,14 +3372,12 @@
         </w:rPr>
         <w:t xml:space="preserve"> </w:t>
       </w:r>
-      <w:proofErr w:type="spellStart"/>
       <w:r>
         <w:rPr>
           <w:spacing w:val="-4"/>
         </w:rPr>
         <w:t>Consulting</w:t>
       </w:r>
-      <w:proofErr w:type="spellEnd"/>
     </w:p>
     <w:p>
       <w:pPr>
@@ -3542,14 +3540,12 @@
       <w:r>
         <w:t xml:space="preserve">Silver </w:t>
       </w:r>
-      <w:proofErr w:type="spellStart"/>
       <w:r>
         <w:rPr>
           <w:spacing w:val="-2"/>
         </w:rPr>
         <w:t>Consulting</w:t>
       </w:r>
-      <w:proofErr w:type="spellEnd"/>
     </w:p>
     <w:p>
       <w:pPr>
@@ -18189,17 +18185,6 @@
     <w:p>
       <w:pPr>
         <w:spacing w:before="1" w:line="280" w:lineRule="auto"/>
-        <w:ind w:left="720"/>
-      </w:pPr>
-    </w:p>
-    <w:p>
-      <w:pPr>
-        <w:spacing w:before="1" w:line="280" w:lineRule="auto"/>
-      </w:pPr>
-    </w:p>
-    <w:p>
-      <w:pPr>
-        <w:spacing w:before="1" w:line="280" w:lineRule="auto"/>
         <w:rPr>
           <w:rFonts w:ascii="Tahoma"/>
           <w:b/>
@@ -18218,6 +18203,7 @@
         <w:rPr>
           <w:b/>
           <w:sz w:val="22"/>
+          <w:u w:val="single"/>
         </w:rPr>
       </w:pPr>
     </w:p>
@@ -18664,6 +18650,13 @@
                 <w:spacing w:val="-6"/>
               </w:rPr>
               <w:t>}}</w:t>
+            </w:r>
+            <w:r>
+              <w:rPr>
+                <w:b/>
+                <w:spacing w:val="-6"/>
+              </w:rPr>
+              <w:t xml:space="preserve"> </w:t>
             </w:r>
           </w:p>
         </w:tc>
@@ -19276,7 +19269,7 @@
 </file>
 
 <file path=word/endnotes.xml><?xml version="1.0" encoding="utf-8"?>
-<w:endnotes xmlns:wpc="http://schemas.microsoft.com/office/word/2010/wordprocessingCanvas" xmlns:cx="http://schemas.microsoft.com/office/drawing/2014/chartex" xmlns:cx1="http://schemas.microsoft.com/office/drawing/2015/9/8/chartex" xmlns:cx2="http://schemas.microsoft.com/office/drawing/2015/10/21/chartex" xmlns:cx3="http://schemas.microsoft.com/office/drawing/2016/5/9/chartex" xmlns:cx4="http://schemas.microsoft.com/office/drawing/2016/5/10/chartex" xmlns:cx5="http://schemas.microsoft.com/office/drawing/2016/5/11/chartex" xmlns:cx6="http://schemas.microsoft.com/office/drawing/2016/5/12/chartex" xmlns:cx7="http://schemas.microsoft.com/office/drawing/2016/5/13/chartex" xmlns:cx8="http://schemas.microsoft.com/office/drawing/2016/5/14/chartex" xmlns:mc="http://schemas.openxmlformats.org/markup-compatibility/2006" xmlns:aink="http://schemas.microsoft.com/office/drawing/2016/ink" xmlns:am3d="http://schemas.microsoft.com/office/drawing/2017/model3d" xmlns:o="urn:schemas-microsoft-com:office:office" xmlns:oel="http://schemas.microsoft.com/office/2019/extlst" xmlns:r="http://schemas.openxmlformats.org/officeDocument/2006/relationships" xmlns:m="http://schemas.openxmlformats.org/officeDocument/2006/math" xmlns:v="urn:schemas-microsoft-com:vml" xmlns:wp14="http://schemas.microsoft.com/office/word/2010/wordprocessingDrawing" xmlns:wp="http://schemas.openxmlformats.org/drawingml/2006/wordprocessingDrawing" xmlns:w10="urn:schemas-microsoft-com:office:word" xmlns:w="http://schemas.openxmlformats.org/wordprocessingml/2006/main" xmlns:w14="http://schemas.microsoft.com/office/word/2010/wordml" xmlns:w15="http://schemas.microsoft.com/office/word/2012/wordml" xmlns:w16cex="http://schemas.microsoft.com/office/word/2018/wordml/cex" xmlns:w16cid="http://schemas.microsoft.com/office/word/2016/wordml/cid" xmlns:w16="http://schemas.microsoft.com/office/word/2018/wordml" xmlns:w16du="http://schemas.microsoft.com/office/word/2023/wordml/word16du" xmlns:w16sdtdh="http://schemas.microsoft.com/office/word/2020/wordml/sdtdatahash" xmlns:w16sdtfl="http://schemas.microsoft.com/office/word/2024/wordml/sdtformatlock" xmlns:w16se="http://schemas.microsoft.com/office/word/2015/wordml/symex" xmlns:wpg="http://schemas.microsoft.com/office/word/2010/wordprocessingGroup" xmlns:wpi="http://schemas.microsoft.com/office/word/2010/wordprocessingInk" xmlns:wne="http://schemas.microsoft.com/office/word/2006/wordml" xmlns:wps="http://schemas.microsoft.com/office/word/2010/wordprocessingShape" mc:Ignorable="w14 w15 w16se w16cid w16 w16cex w16sdtdh w16sdtfl w16du wp14">
+<w:endnotes xmlns:wpc="http://schemas.microsoft.com/office/word/2010/wordprocessingCanvas" xmlns:cx="http://schemas.microsoft.com/office/drawing/2014/chartex" xmlns:cx1="http://schemas.microsoft.com/office/drawing/2015/9/8/chartex" xmlns:cx2="http://schemas.microsoft.com/office/drawing/2015/10/21/chartex" xmlns:cx3="http://schemas.microsoft.com/office/drawing/2016/5/9/chartex" xmlns:cx4="http://schemas.microsoft.com/office/drawing/2016/5/10/chartex" xmlns:cx5="http://schemas.microsoft.com/office/drawing/2016/5/11/chartex" xmlns:cx6="http://schemas.microsoft.com/office/drawing/2016/5/12/chartex" xmlns:cx7="http://schemas.microsoft.com/office/drawing/2016/5/13/chartex" xmlns:cx8="http://schemas.microsoft.com/office/drawing/2016/5/14/chartex" xmlns:mc="http://schemas.openxmlformats.org/markup-compatibility/2006" xmlns:aink="http://schemas.microsoft.com/office/drawing/2016/ink" xmlns:am3d="http://schemas.microsoft.com/office/drawing/2017/model3d" xmlns:o="urn:schemas-microsoft-com:office:office" xmlns:oel="http://schemas.microsoft.com/office/2019/extlst" xmlns:r="http://schemas.openxmlformats.org/officeDocument/2006/relationships" xmlns:m="http://schemas.openxmlformats.org/officeDocument/2006/math" xmlns:v="urn:schemas-microsoft-com:vml" xmlns:wp14="http://schemas.microsoft.com/office/word/2010/wordprocessingDrawing" xmlns:wp="http://schemas.openxmlformats.org/drawingml/2006/wordprocessingDrawing" xmlns:w10="urn:schemas-microsoft-com:office:word" xmlns:w="http://schemas.openxmlformats.org/wordprocessingml/2006/main" xmlns:w14="http://schemas.microsoft.com/office/word/2010/wordml" xmlns:w15="http://schemas.microsoft.com/office/word/2012/wordml" xmlns:w16cei="http://schemas.microsoft.com/office/word/2026/wordml/cei" xmlns:w16cex="http://schemas.microsoft.com/office/word/2018/wordml/cex" xmlns:w16cid="http://schemas.microsoft.com/office/word/2016/wordml/cid" xmlns:w16="http://schemas.microsoft.com/office/word/2018/wordml" xmlns:w16du="http://schemas.microsoft.com/office/word/2023/wordml/word16du" xmlns:w16sdtdh="http://schemas.microsoft.com/office/word/2020/wordml/sdtdatahash" xmlns:w16sdtfl="http://schemas.microsoft.com/office/word/2024/wordml/sdtformatlock" xmlns:w16se="http://schemas.microsoft.com/office/word/2015/wordml/symex" xmlns:wpg="http://schemas.microsoft.com/office/word/2010/wordprocessingGroup" xmlns:wpi="http://schemas.microsoft.com/office/word/2010/wordprocessingInk" xmlns:wne="http://schemas.microsoft.com/office/word/2006/wordml" xmlns:wps="http://schemas.microsoft.com/office/word/2010/wordprocessingShape" mc:Ignorable="w14 w15 w16se w16cid w16 w16cex w16sdtdh w16sdtfl w16du wp14">
   <w:endnote w:type="separator" w:id="-1">
     <w:p>
       <w:r>
@@ -19295,7 +19288,7 @@
 </file>
 
 <file path=word/footer1.xml><?xml version="1.0" encoding="utf-8"?>
-<w:ftr xmlns:wpc="http://schemas.microsoft.com/office/word/2010/wordprocessingCanvas" xmlns:cx="http://schemas.microsoft.com/office/drawing/2014/chartex" xmlns:cx1="http://schemas.microsoft.com/office/drawing/2015/9/8/chartex" xmlns:cx2="http://schemas.microsoft.com/office/drawing/2015/10/21/chartex" xmlns:cx3="http://schemas.microsoft.com/office/drawing/2016/5/9/chartex" xmlns:cx4="http://schemas.microsoft.com/office/drawing/2016/5/10/chartex" xmlns:cx5="http://schemas.microsoft.com/office/drawing/2016/5/11/chartex" xmlns:cx6="http://schemas.microsoft.com/office/drawing/2016/5/12/chartex" xmlns:cx7="http://schemas.microsoft.com/office/drawing/2016/5/13/chartex" xmlns:cx8="http://schemas.microsoft.com/office/drawing/2016/5/14/chartex" xmlns:mc="http://schemas.openxmlformats.org/markup-compatibility/2006" xmlns:aink="http://schemas.microsoft.com/office/drawing/2016/ink" xmlns:am3d="http://schemas.microsoft.com/office/drawing/2017/model3d" xmlns:o="urn:schemas-microsoft-com:office:office" xmlns:oel="http://schemas.microsoft.com/office/2019/extlst" xmlns:r="http://schemas.openxmlformats.org/officeDocument/2006/relationships" xmlns:m="http://schemas.openxmlformats.org/officeDocument/2006/math" xmlns:v="urn:schemas-microsoft-com:vml" xmlns:wp14="http://schemas.microsoft.com/office/word/2010/wordprocessingDrawing" xmlns:wp="http://schemas.openxmlformats.org/drawingml/2006/wordprocessingDrawing" xmlns:w10="urn:schemas-microsoft-com:office:word" xmlns:w="http://schemas.openxmlformats.org/wordprocessingml/2006/main" xmlns:w14="http://schemas.microsoft.com/office/word/2010/wordml" xmlns:w15="http://schemas.microsoft.com/office/word/2012/wordml" xmlns:w16cex="http://schemas.microsoft.com/office/word/2018/wordml/cex" xmlns:w16cid="http://schemas.microsoft.com/office/word/2016/wordml/cid" xmlns:w16="http://schemas.microsoft.com/office/word/2018/wordml" xmlns:w16du="http://schemas.microsoft.com/office/word/2023/wordml/word16du" xmlns:w16sdtdh="http://schemas.microsoft.com/office/word/2020/wordml/sdtdatahash" xmlns:w16sdtfl="http://schemas.microsoft.com/office/word/2024/wordml/sdtformatlock" xmlns:w16se="http://schemas.microsoft.com/office/word/2015/wordml/symex" xmlns:wpg="http://schemas.microsoft.com/office/word/2010/wordprocessingGroup" xmlns:wpi="http://schemas.microsoft.com/office/word/2010/wordprocessingInk" xmlns:wne="http://schemas.microsoft.com/office/word/2006/wordml" xmlns:wps="http://schemas.microsoft.com/office/word/2010/wordprocessingShape" mc:Ignorable="w14 w15 w16se w16cid w16 w16cex w16sdtdh w16sdtfl w16du wp14">
+<w:ftr xmlns:wpc="http://schemas.microsoft.com/office/word/2010/wordprocessingCanvas" xmlns:cx="http://schemas.microsoft.com/office/drawing/2014/chartex" xmlns:cx1="http://schemas.microsoft.com/office/drawing/2015/9/8/chartex" xmlns:cx2="http://schemas.microsoft.com/office/drawing/2015/10/21/chartex" xmlns:cx3="http://schemas.microsoft.com/office/drawing/2016/5/9/chartex" xmlns:cx4="http://schemas.microsoft.com/office/drawing/2016/5/10/chartex" xmlns:cx5="http://schemas.microsoft.com/office/drawing/2016/5/11/chartex" xmlns:cx6="http://schemas.microsoft.com/office/drawing/2016/5/12/chartex" xmlns:cx7="http://schemas.microsoft.com/office/drawing/2016/5/13/chartex" xmlns:cx8="http://schemas.microsoft.com/office/drawing/2016/5/14/chartex" xmlns:mc="http://schemas.openxmlformats.org/markup-compatibility/2006" xmlns:aink="http://schemas.microsoft.com/office/drawing/2016/ink" xmlns:am3d="http://schemas.microsoft.com/office/drawing/2017/model3d" xmlns:o="urn:schemas-microsoft-com:office:office" xmlns:oel="http://schemas.microsoft.com/office/2019/extlst" xmlns:r="http://schemas.openxmlformats.org/officeDocument/2006/relationships" xmlns:m="http://schemas.openxmlformats.org/officeDocument/2006/math" xmlns:v="urn:schemas-microsoft-com:vml" xmlns:wp14="http://schemas.microsoft.com/office/word/2010/wordprocessingDrawing" xmlns:wp="http://schemas.openxmlformats.org/drawingml/2006/wordprocessingDrawing" xmlns:w10="urn:schemas-microsoft-com:office:word" xmlns:w="http://schemas.openxmlformats.org/wordprocessingml/2006/main" xmlns:w14="http://schemas.microsoft.com/office/word/2010/wordml" xmlns:w15="http://schemas.microsoft.com/office/word/2012/wordml" xmlns:w16cei="http://schemas.microsoft.com/office/word/2026/wordml/cei" xmlns:w16cex="http://schemas.microsoft.com/office/word/2018/wordml/cex" xmlns:w16cid="http://schemas.microsoft.com/office/word/2016/wordml/cid" xmlns:w16="http://schemas.microsoft.com/office/word/2018/wordml" xmlns:w16du="http://schemas.microsoft.com/office/word/2023/wordml/word16du" xmlns:w16sdtdh="http://schemas.microsoft.com/office/word/2020/wordml/sdtdatahash" xmlns:w16sdtfl="http://schemas.microsoft.com/office/word/2024/wordml/sdtformatlock" xmlns:w16se="http://schemas.microsoft.com/office/word/2015/wordml/symex" xmlns:wpg="http://schemas.microsoft.com/office/word/2010/wordprocessingGroup" xmlns:wpi="http://schemas.microsoft.com/office/word/2010/wordprocessingInk" xmlns:wne="http://schemas.microsoft.com/office/word/2006/wordml" xmlns:wps="http://schemas.microsoft.com/office/word/2010/wordprocessingShape" mc:Ignorable="w14 w15 w16se w16cid w16 w16cex w16sdtdh w16sdtfl w16du wp14">
   <w:p>
     <w:pPr>
       <w:pStyle w:val="Textoindependiente"/>
@@ -19643,7 +19636,7 @@
 </file>
 
 <file path=word/footnotes.xml><?xml version="1.0" encoding="utf-8"?>
-<w:footnotes xmlns:wpc="http://schemas.microsoft.com/office/word/2010/wordprocessingCanvas" xmlns:cx="http://schemas.microsoft.com/office/drawing/2014/chartex" xmlns:cx1="http://schemas.microsoft.com/office/drawing/2015/9/8/chartex" xmlns:cx2="http://schemas.microsoft.com/office/drawing/2015/10/21/chartex" xmlns:cx3="http://schemas.microsoft.com/office/drawing/2016/5/9/chartex" xmlns:cx4="http://schemas.microsoft.com/office/drawing/2016/5/10/chartex" xmlns:cx5="http://schemas.microsoft.com/office/drawing/2016/5/11/chartex" xmlns:cx6="http://schemas.microsoft.com/office/drawing/2016/5/12/chartex" xmlns:cx7="http://schemas.microsoft.com/office/drawing/2016/5/13/chartex" xmlns:cx8="http://schemas.microsoft.com/office/drawing/2016/5/14/chartex" xmlns:mc="http://schemas.openxmlformats.org/markup-compatibility/2006" xmlns:aink="http://schemas.microsoft.com/office/drawing/2016/ink" xmlns:am3d="http://schemas.microsoft.com/office/drawing/2017/model3d" xmlns:o="urn:schemas-microsoft-com:office:office" xmlns:oel="http://schemas.microsoft.com/office/2019/extlst" xmlns:r="http://schemas.openxmlformats.org/officeDocument/2006/relationships" xmlns:m="http://schemas.openxmlformats.org/officeDocument/2006/math" xmlns:v="urn:schemas-microsoft-com:vml" xmlns:wp14="http://schemas.microsoft.com/office/word/2010/wordprocessingDrawing" xmlns:wp="http://schemas.openxmlformats.org/drawingml/2006/wordprocessingDrawing" xmlns:w10="urn:schemas-microsoft-com:office:word" xmlns:w="http://schemas.openxmlformats.org/wordprocessingml/2006/main" xmlns:w14="http://schemas.microsoft.com/office/word/2010/wordml" xmlns:w15="http://schemas.microsoft.com/office/word/2012/wordml" xmlns:w16cex="http://schemas.microsoft.com/office/word/2018/wordml/cex" xmlns:w16cid="http://schemas.microsoft.com/office/word/2016/wordml/cid" xmlns:w16="http://schemas.microsoft.com/office/word/2018/wordml" xmlns:w16du="http://schemas.microsoft.com/office/word/2023/wordml/word16du" xmlns:w16sdtdh="http://schemas.microsoft.com/office/word/2020/wordml/sdtdatahash" xmlns:w16sdtfl="http://schemas.microsoft.com/office/word/2024/wordml/sdtformatlock" xmlns:w16se="http://schemas.microsoft.com/office/word/2015/wordml/symex" xmlns:wpg="http://schemas.microsoft.com/office/word/2010/wordprocessingGroup" xmlns:wpi="http://schemas.microsoft.com/office/word/2010/wordprocessingInk" xmlns:wne="http://schemas.microsoft.com/office/word/2006/wordml" xmlns:wps="http://schemas.microsoft.com/office/word/2010/wordprocessingShape" mc:Ignorable="w14 w15 w16se w16cid w16 w16cex w16sdtdh w16sdtfl w16du wp14">
+<w:footnotes xmlns:wpc="http://schemas.microsoft.com/office/word/2010/wordprocessingCanvas" xmlns:cx="http://schemas.microsoft.com/office/drawing/2014/chartex" xmlns:cx1="http://schemas.microsoft.com/office/drawing/2015/9/8/chartex" xmlns:cx2="http://schemas.microsoft.com/office/drawing/2015/10/21/chartex" xmlns:cx3="http://schemas.microsoft.com/office/drawing/2016/5/9/chartex" xmlns:cx4="http://schemas.microsoft.com/office/drawing/2016/5/10/chartex" xmlns:cx5="http://schemas.microsoft.com/office/drawing/2016/5/11/chartex" xmlns:cx6="http://schemas.microsoft.com/office/drawing/2016/5/12/chartex" xmlns:cx7="http://schemas.microsoft.com/office/drawing/2016/5/13/chartex" xmlns:cx8="http://schemas.microsoft.com/office/drawing/2016/5/14/chartex" xmlns:mc="http://schemas.openxmlformats.org/markup-compatibility/2006" xmlns:aink="http://schemas.microsoft.com/office/drawing/2016/ink" xmlns:am3d="http://schemas.microsoft.com/office/drawing/2017/model3d" xmlns:o="urn:schemas-microsoft-com:office:office" xmlns:oel="http://schemas.microsoft.com/office/2019/extlst" xmlns:r="http://schemas.openxmlformats.org/officeDocument/2006/relationships" xmlns:m="http://schemas.openxmlformats.org/officeDocument/2006/math" xmlns:v="urn:schemas-microsoft-com:vml" xmlns:wp14="http://schemas.microsoft.com/office/word/2010/wordprocessingDrawing" xmlns:wp="http://schemas.openxmlformats.org/drawingml/2006/wordprocessingDrawing" xmlns:w10="urn:schemas-microsoft-com:office:word" xmlns:w="http://schemas.openxmlformats.org/wordprocessingml/2006/main" xmlns:w14="http://schemas.microsoft.com/office/word/2010/wordml" xmlns:w15="http://schemas.microsoft.com/office/word/2012/wordml" xmlns:w16cei="http://schemas.microsoft.com/office/word/2026/wordml/cei" xmlns:w16cex="http://schemas.microsoft.com/office/word/2018/wordml/cex" xmlns:w16cid="http://schemas.microsoft.com/office/word/2016/wordml/cid" xmlns:w16="http://schemas.microsoft.com/office/word/2018/wordml" xmlns:w16du="http://schemas.microsoft.com/office/word/2023/wordml/word16du" xmlns:w16sdtdh="http://schemas.microsoft.com/office/word/2020/wordml/sdtdatahash" xmlns:w16sdtfl="http://schemas.microsoft.com/office/word/2024/wordml/sdtformatlock" xmlns:w16se="http://schemas.microsoft.com/office/word/2015/wordml/symex" xmlns:wpg="http://schemas.microsoft.com/office/word/2010/wordprocessingGroup" xmlns:wpi="http://schemas.microsoft.com/office/word/2010/wordprocessingInk" xmlns:wne="http://schemas.microsoft.com/office/word/2006/wordml" xmlns:wps="http://schemas.microsoft.com/office/word/2010/wordprocessingShape" mc:Ignorable="w14 w15 w16se w16cid w16 w16cex w16sdtdh w16sdtfl w16du wp14">
   <w:footnote w:type="separator" w:id="-1">
     <w:p>
       <w:r>
@@ -19662,7 +19655,7 @@
 </file>
 
 <file path=word/numbering.xml><?xml version="1.0" encoding="utf-8"?>
-<w:numbering xmlns:wpc="http://schemas.microsoft.com/office/word/2010/wordprocessingCanvas" xmlns:cx="http://schemas.microsoft.com/office/drawing/2014/chartex" xmlns:cx1="http://schemas.microsoft.com/office/drawing/2015/9/8/chartex" xmlns:cx2="http://schemas.microsoft.com/office/drawing/2015/10/21/chartex" xmlns:cx3="http://schemas.microsoft.com/office/drawing/2016/5/9/chartex" xmlns:cx4="http://schemas.microsoft.com/office/drawing/2016/5/10/chartex" xmlns:cx5="http://schemas.microsoft.com/office/drawing/2016/5/11/chartex" xmlns:cx6="http://schemas.microsoft.com/office/drawing/2016/5/12/chartex" xmlns:cx7="http://schemas.microsoft.com/office/drawing/2016/5/13/chartex" xmlns:cx8="http://schemas.microsoft.com/office/drawing/2016/5/14/chartex" xmlns:mc="http://schemas.openxmlformats.org/markup-compatibility/2006" xmlns:aink="http://schemas.microsoft.com/office/drawing/2016/ink" xmlns:am3d="http://schemas.microsoft.com/office/drawing/2017/model3d" xmlns:o="urn:schemas-microsoft-com:office:office" xmlns:oel="http://schemas.microsoft.com/office/2019/extlst" xmlns:r="http://schemas.openxmlformats.org/officeDocument/2006/relationships" xmlns:m="http://schemas.openxmlformats.org/officeDocument/2006/math" xmlns:v="urn:schemas-microsoft-com:vml" xmlns:wp14="http://schemas.microsoft.com/office/word/2010/wordprocessingDrawing" xmlns:wp="http://schemas.openxmlformats.org/drawingml/2006/wordprocessingDrawing" xmlns:w10="urn:schemas-microsoft-com:office:word" xmlns:w="http://schemas.openxmlformats.org/wordprocessingml/2006/main" xmlns:w14="http://schemas.microsoft.com/office/word/2010/wordml" xmlns:w15="http://schemas.microsoft.com/office/word/2012/wordml" xmlns:w16cex="http://schemas.microsoft.com/office/word/2018/wordml/cex" xmlns:w16cid="http://schemas.microsoft.com/office/word/2016/wordml/cid" xmlns:w16="http://schemas.microsoft.com/office/word/2018/wordml" xmlns:w16du="http://schemas.microsoft.com/office/word/2023/wordml/word16du" xmlns:w16sdtdh="http://schemas.microsoft.com/office/word/2020/wordml/sdtdatahash" xmlns:w16sdtfl="http://schemas.microsoft.com/office/word/2024/wordml/sdtformatlock" xmlns:w16se="http://schemas.microsoft.com/office/word/2015/wordml/symex" xmlns:wpg="http://schemas.microsoft.com/office/word/2010/wordprocessingGroup" xmlns:wpi="http://schemas.microsoft.com/office/word/2010/wordprocessingInk" xmlns:wne="http://schemas.microsoft.com/office/word/2006/wordml" xmlns:wps="http://schemas.microsoft.com/office/word/2010/wordprocessingShape" mc:Ignorable="w14 w15 w16se w16cid w16 w16cex w16sdtdh w16sdtfl w16du wp14">
+<w:numbering xmlns:wpc="http://schemas.microsoft.com/office/word/2010/wordprocessingCanvas" xmlns:cx="http://schemas.microsoft.com/office/drawing/2014/chartex" xmlns:cx1="http://schemas.microsoft.com/office/drawing/2015/9/8/chartex" xmlns:cx2="http://schemas.microsoft.com/office/drawing/2015/10/21/chartex" xmlns:cx3="http://schemas.microsoft.com/office/drawing/2016/5/9/chartex" xmlns:cx4="http://schemas.microsoft.com/office/drawing/2016/5/10/chartex" xmlns:cx5="http://schemas.microsoft.com/office/drawing/2016/5/11/chartex" xmlns:cx6="http://schemas.microsoft.com/office/drawing/2016/5/12/chartex" xmlns:cx7="http://schemas.microsoft.com/office/drawing/2016/5/13/chartex" xmlns:cx8="http://schemas.microsoft.com/office/drawing/2016/5/14/chartex" xmlns:mc="http://schemas.openxmlformats.org/markup-compatibility/2006" xmlns:aink="http://schemas.microsoft.com/office/drawing/2016/ink" xmlns:am3d="http://schemas.microsoft.com/office/drawing/2017/model3d" xmlns:o="urn:schemas-microsoft-com:office:office" xmlns:oel="http://schemas.microsoft.com/office/2019/extlst" xmlns:r="http://schemas.openxmlformats.org/officeDocument/2006/relationships" xmlns:m="http://schemas.openxmlformats.org/officeDocument/2006/math" xmlns:v="urn:schemas-microsoft-com:vml" xmlns:wp14="http://schemas.microsoft.com/office/word/2010/wordprocessingDrawing" xmlns:wp="http://schemas.openxmlformats.org/drawingml/2006/wordprocessingDrawing" xmlns:w10="urn:schemas-microsoft-com:office:word" xmlns:w="http://schemas.openxmlformats.org/wordprocessingml/2006/main" xmlns:w14="http://schemas.microsoft.com/office/word/2010/wordml" xmlns:w15="http://schemas.microsoft.com/office/word/2012/wordml" xmlns:w16cei="http://schemas.microsoft.com/office/word/2026/wordml/cei" xmlns:w16cex="http://schemas.microsoft.com/office/word/2018/wordml/cex" xmlns:w16cid="http://schemas.microsoft.com/office/word/2016/wordml/cid" xmlns:w16="http://schemas.microsoft.com/office/word/2018/wordml" xmlns:w16du="http://schemas.microsoft.com/office/word/2023/wordml/word16du" xmlns:w16sdtdh="http://schemas.microsoft.com/office/word/2020/wordml/sdtdatahash" xmlns:w16sdtfl="http://schemas.microsoft.com/office/word/2024/wordml/sdtformatlock" xmlns:w16se="http://schemas.microsoft.com/office/word/2015/wordml/symex" xmlns:wpg="http://schemas.microsoft.com/office/word/2010/wordprocessingGroup" xmlns:wpi="http://schemas.microsoft.com/office/word/2010/wordprocessingInk" xmlns:wne="http://schemas.microsoft.com/office/word/2006/wordml" xmlns:wps="http://schemas.microsoft.com/office/word/2010/wordprocessingShape" mc:Ignorable="w14 w15 w16se w16cid w16 w16cex w16sdtdh w16sdtfl w16du wp14">
   <w:abstractNum w:abstractNumId="0" w15:restartNumberingAfterBreak="0">
     <w:nsid w:val="1FA1299C"/>
     <w:multiLevelType w:val="hybridMultilevel"/>
@@ -20499,6 +20492,7 @@
   <w:style w:type="character" w:default="1" w:styleId="Fuentedeprrafopredeter">
     <w:name w:val="Default Paragraph Font"/>
     <w:uiPriority w:val="1"/>
+    <w:semiHidden/>
     <w:unhideWhenUsed/>
   </w:style>
   <w:style w:type="table" w:default="1" w:styleId="Tablanormal">

</xml_diff>